<commit_message>
Ajusta los documentos de la Fase 2
Quita el resaltado de las conclusiones del informe de avance y deja las
autoevaluaciones 2.2 de Jean y Oscar en PDF con el nombre que pide la guía.

Co-Authored-By: Claude Opus 5.5 <noreply@anthropic.com>
</commit_message>
<xml_diff>
--- a/FASE 2/01_Informe_y_Guia/Informe Proyecto Acredittia Administracion del Negocio Fase 2.docx
+++ b/FASE 2/01_Informe_y_Guia/Informe Proyecto Acredittia Administracion del Negocio Fase 2.docx
@@ -50,8 +50,13 @@
       </w:pPr>
       <w:bookmarkStart w:id="0" w:name="_heading=h.1kbm8tvpom4" w:colFirst="0" w:colLast="0"/>
       <w:bookmarkEnd w:id="0"/>
-      <w:r>
-        <w:t>Acredittia Administración del Negocio</w:t>
+      <w:proofErr w:type="spellStart"/>
+      <w:r>
+        <w:t>Acredittia</w:t>
+      </w:r>
+      <w:proofErr w:type="spellEnd"/>
+      <w:r>
+        <w:t xml:space="preserve"> Administración del Negocio</w:t>
       </w:r>
     </w:p>
     <w:p/>
@@ -366,7 +371,15 @@
         <w:t>Asignatura</w:t>
       </w:r>
       <w:r>
-        <w:t>: Capstone 300D PTY4614 · Grupo 4</w:t>
+        <w:t xml:space="preserve">: </w:t>
+      </w:r>
+      <w:proofErr w:type="spellStart"/>
+      <w:r>
+        <w:t>Capstone</w:t>
+      </w:r>
+      <w:proofErr w:type="spellEnd"/>
+      <w:r>
+        <w:t xml:space="preserve"> 300D PTY4614 · Grupo 4</w:t>
       </w:r>
     </w:p>
     <w:p>
@@ -390,8 +403,13 @@
         <w:t>Mandante</w:t>
       </w:r>
       <w:r>
-        <w:t>: Alloxentric</w:t>
-      </w:r>
+        <w:t xml:space="preserve">: </w:t>
+      </w:r>
+      <w:proofErr w:type="spellStart"/>
+      <w:r>
+        <w:t>Alloxentric</w:t>
+      </w:r>
+      <w:proofErr w:type="spellEnd"/>
     </w:p>
     <w:p>
       <w:r>
@@ -414,8 +432,21 @@
         <w:t>Repositorio de documentación</w:t>
       </w:r>
       <w:r>
-        <w:t>: github.com/Dntex2/proyecto-capstone-acredittia-administracion</w:t>
-      </w:r>
+        <w:t>: github.com/Dntex2/proyecto-</w:t>
+      </w:r>
+      <w:proofErr w:type="spellStart"/>
+      <w:r>
+        <w:t>capstone</w:t>
+      </w:r>
+      <w:proofErr w:type="spellEnd"/>
+      <w:r>
+        <w:t>-</w:t>
+      </w:r>
+      <w:proofErr w:type="spellStart"/>
+      <w:r>
+        <w:t>acredittia-administracion</w:t>
+      </w:r>
+      <w:proofErr w:type="spellEnd"/>
     </w:p>
     <w:p>
       <w:r>
@@ -426,8 +457,13 @@
         <w:t>Repositorio de código (privado)</w:t>
       </w:r>
       <w:r>
-        <w:t>: github.com/Dntex2/Acredittia-Administracion</w:t>
-      </w:r>
+        <w:t>: github.com/Dntex2/</w:t>
+      </w:r>
+      <w:proofErr w:type="spellStart"/>
+      <w:r>
+        <w:t>Acredittia-Administracion</w:t>
+      </w:r>
+      <w:proofErr w:type="spellEnd"/>
     </w:p>
     <w:p>
       <w:pPr>
@@ -454,7 +490,6 @@
           <w:docPartUnique/>
         </w:docPartObj>
       </w:sdtPr>
-      <w:sdtEndPr/>
       <w:sdtContent>
         <w:p>
           <w:pPr>
@@ -2276,11 +2311,53 @@
         <w:spacing w:after="160"/>
         <w:jc w:val="both"/>
       </w:pPr>
-      <w:r>
-        <w:t>Acredittia Administración del Negocio es el backoffice de una plataforma SaaS que acredita a empresas contratistas en faenas mineras. El proyecto desarrolla su backend con FastAPI y PostgreSQL y su frontend con Next.js, sobre la plataforma base entregada por Alloxentric. A la semana 9 se completaron la extensión del modelo de datos, la API de administración, el ciclo de suscripciones con pago simulado y control de morosidad, la consola interna de administración con auditoría de accesos y las pantallas de su</w:t>
-      </w:r>
-      <w:r>
-        <w:t>scripción del portal. El sistema corre en Docker, aprueba 339 pruebas automatizadas y se publicó como MVP accesible por internet. Quedan pendientes el despliegue en la nube, la pasarela de pago real y la documentación técnica.</w:t>
+      <w:proofErr w:type="spellStart"/>
+      <w:r>
+        <w:t>Acredittia</w:t>
+      </w:r>
+      <w:proofErr w:type="spellEnd"/>
+      <w:r>
+        <w:t xml:space="preserve"> Administración del Negocio es el </w:t>
+      </w:r>
+      <w:proofErr w:type="spellStart"/>
+      <w:r>
+        <w:t>backoffice</w:t>
+      </w:r>
+      <w:proofErr w:type="spellEnd"/>
+      <w:r>
+        <w:t xml:space="preserve"> de una plataforma SaaS que acredita a empresas contratistas en faenas mineras. El proyecto desarrolla su </w:t>
+      </w:r>
+      <w:proofErr w:type="spellStart"/>
+      <w:r>
+        <w:t>backend</w:t>
+      </w:r>
+      <w:proofErr w:type="spellEnd"/>
+      <w:r>
+        <w:t xml:space="preserve"> con </w:t>
+      </w:r>
+      <w:proofErr w:type="spellStart"/>
+      <w:r>
+        <w:t>FastAPI</w:t>
+      </w:r>
+      <w:proofErr w:type="spellEnd"/>
+      <w:r>
+        <w:t xml:space="preserve"> y PostgreSQL y su </w:t>
+      </w:r>
+      <w:proofErr w:type="spellStart"/>
+      <w:r>
+        <w:t>frontend</w:t>
+      </w:r>
+      <w:proofErr w:type="spellEnd"/>
+      <w:r>
+        <w:t xml:space="preserve"> con Next.js, sobre la plataforma base entregada por </w:t>
+      </w:r>
+      <w:proofErr w:type="spellStart"/>
+      <w:r>
+        <w:t>Alloxentric</w:t>
+      </w:r>
+      <w:proofErr w:type="spellEnd"/>
+      <w:r>
+        <w:t>. A la semana 9 se completaron la extensión del modelo de datos, la API de administración, el ciclo de suscripciones con pago simulado y control de morosidad, la consola interna de administración con auditoría de accesos y las pantallas de suscripción del portal. El sistema corre en Docker, aprueba 339 pruebas automatizadas y se publicó como MVP accesible por internet. Quedan pendientes el despliegue en la nube, la pasarela de pago real y la documentación técnica.</w:t>
       </w:r>
     </w:p>
     <w:p>
@@ -2288,27 +2365,59 @@
         <w:pStyle w:val="Ttulo1"/>
       </w:pPr>
       <w:bookmarkStart w:id="3" w:name="_Toc242915911"/>
+      <w:proofErr w:type="spellStart"/>
       <w:r>
         <w:t>Abstract</w:t>
       </w:r>
       <w:bookmarkEnd w:id="3"/>
+      <w:proofErr w:type="spellEnd"/>
     </w:p>
     <w:p>
       <w:pPr>
         <w:spacing w:after="160"/>
         <w:jc w:val="both"/>
       </w:pPr>
+      <w:proofErr w:type="spellStart"/>
       <w:r>
         <w:rPr>
           <w:lang w:val="en-US"/>
         </w:rPr>
-        <w:t>Acredittia Business Administration is the back office of a SaaS platform that accredits contractor companies at mining sites. The project builds its backend with FastAPI and PostgreSQL and its frontend with Next.js, on top of the base platform provided by Alloxentric. By week 9, the team has completed the data model extension, the administration API, the subscription cycle with simulated payments and overdue-account control, the internal administration console with access auditing, and the subscription scre</w:t>
-      </w:r>
+        <w:t>Acredittia</w:t>
+      </w:r>
+      <w:proofErr w:type="spellEnd"/>
       <w:r>
         <w:rPr>
           <w:lang w:val="en-US"/>
         </w:rPr>
-        <w:t>ens of the client portal. The system runs on Docker, passes 339 automated tests, and was published online as an MVP. Cloud deployment, a real payment gateway, and the technical documentation remain pending.</w:t>
+        <w:t xml:space="preserve"> Business Administration is the back office of a SaaS platform that accredits contractor companies at mining sites. The project builds its backend with </w:t>
+      </w:r>
+      <w:proofErr w:type="spellStart"/>
+      <w:r>
+        <w:rPr>
+          <w:lang w:val="en-US"/>
+        </w:rPr>
+        <w:t>FastAPI</w:t>
+      </w:r>
+      <w:proofErr w:type="spellEnd"/>
+      <w:r>
+        <w:rPr>
+          <w:lang w:val="en-US"/>
+        </w:rPr>
+        <w:t xml:space="preserve"> and PostgreSQL and its frontend with Next.js, on top of the base platform provided by </w:t>
+      </w:r>
+      <w:proofErr w:type="spellStart"/>
+      <w:r>
+        <w:rPr>
+          <w:lang w:val="en-US"/>
+        </w:rPr>
+        <w:t>Alloxentric</w:t>
+      </w:r>
+      <w:proofErr w:type="spellEnd"/>
+      <w:r>
+        <w:rPr>
+          <w:lang w:val="en-US"/>
+        </w:rPr>
+        <w:t>. By week 9, the team has completed the data model extension, the administration API, the subscription cycle with simulated payments and overdue-account control, the internal administration console with access auditing, and the subscription screens of the client portal. The system runs on Docker, passes 339 automated tests, and was published online as an MVP. Cloud deployment, a real payment gateway, and the technical documentation remain pending.</w:t>
       </w:r>
     </w:p>
     <w:p>
@@ -2348,7 +2457,31 @@
         <w:t xml:space="preserve">Objetivo general. </w:t>
       </w:r>
       <w:r>
-        <w:t>Desarrollar el backend y el frontend del módulo de administración del negocio de Acredittia, integrando a la plataforma la gestión de empresas y catálogos, el ciclo de suscripciones y pagos, y una consola interna de administración con auditoría de accesos.</w:t>
+        <w:t xml:space="preserve">Desarrollar el </w:t>
+      </w:r>
+      <w:proofErr w:type="spellStart"/>
+      <w:r>
+        <w:t>backend</w:t>
+      </w:r>
+      <w:proofErr w:type="spellEnd"/>
+      <w:r>
+        <w:t xml:space="preserve"> y el </w:t>
+      </w:r>
+      <w:proofErr w:type="spellStart"/>
+      <w:r>
+        <w:t>frontend</w:t>
+      </w:r>
+      <w:proofErr w:type="spellEnd"/>
+      <w:r>
+        <w:t xml:space="preserve"> del módulo de administración del negocio de </w:t>
+      </w:r>
+      <w:proofErr w:type="spellStart"/>
+      <w:r>
+        <w:t>Acredittia</w:t>
+      </w:r>
+      <w:proofErr w:type="spellEnd"/>
+      <w:r>
+        <w:t>, integrando a la plataforma la gestión de empresas y catálogos, el ciclo de suscripciones y pagos, y una consola interna de administración con auditoría de accesos.</w:t>
       </w:r>
     </w:p>
     <w:p>
@@ -2363,7 +2496,15 @@
         <w:t xml:space="preserve">Usuarios. </w:t>
       </w:r>
       <w:r>
-        <w:t>El equipo interno de Acredittia, en la consola de administración, y las empresas contratistas, en las pantallas de suscripción y pago del portal.</w:t>
+        <w:t xml:space="preserve">El equipo interno de </w:t>
+      </w:r>
+      <w:proofErr w:type="spellStart"/>
+      <w:r>
+        <w:t>Acredittia</w:t>
+      </w:r>
+      <w:proofErr w:type="spellEnd"/>
+      <w:r>
+        <w:t>, en la consola de administración, y las empresas contratistas, en las pantallas de suscripción y pago del portal.</w:t>
       </w:r>
     </w:p>
     <w:p>
@@ -2407,7 +2548,15 @@
         <w:jc w:val="both"/>
       </w:pPr>
       <w:r>
-        <w:t>A la semana 9, el equipo completó la base técnica del proyecto y entregó al mandante un MVP funcional, compuesto por el Portal del Cliente y la Consola de Administración, que operan sobre la misma API y la misma base de datos.</w:t>
+        <w:t xml:space="preserve">A la semana 9, el equipo completó la base técnica del proyecto y entregó al mandante un MVP funcional, compuesto por el Portal del Cliente y la Consola de Administración, que operan sobre la </w:t>
+      </w:r>
+      <w:proofErr w:type="gramStart"/>
+      <w:r>
+        <w:t>misma API y la misma base</w:t>
+      </w:r>
+      <w:proofErr w:type="gramEnd"/>
+      <w:r>
+        <w:t xml:space="preserve"> de datos.</w:t>
       </w:r>
     </w:p>
     <w:p>
@@ -2426,11 +2575,27 @@
         <w:t xml:space="preserve">OE1, modelo de datos (cumplido): </w:t>
       </w:r>
       <w:r>
-        <w:t xml:space="preserve">se integraron al esquema versionado los scripts de la Consola Interna (07 y 08), con sus funciones de agregación en PL/pgSQL </w:t>
+        <w:t>se integraron al esquema versionado los scripts de la Consola Interna (07 y 08), con sus funciones de agregación en PL/</w:t>
+      </w:r>
+      <w:proofErr w:type="spellStart"/>
+      <w:r>
+        <w:t>pgSQL</w:t>
+      </w:r>
+      <w:proofErr w:type="spellEnd"/>
+      <w:r>
+        <w:t xml:space="preserve"> </w:t>
       </w:r>
       <w:r>
         <w:lastRenderedPageBreak/>
-        <w:t>(Alloxentric, 2026a). La migración se aplica con un bloqueo exclusivo y la API se niega a arrancar si la versión del esquema no coincide. Se corrigieron tres defectos del módulo recibido: tipos incompatibles en funciones, procesos manuales que no se iniciaban y llaves foráneas sin índice.</w:t>
+        <w:t>(</w:t>
+      </w:r>
+      <w:proofErr w:type="spellStart"/>
+      <w:r>
+        <w:t>Alloxentric</w:t>
+      </w:r>
+      <w:proofErr w:type="spellEnd"/>
+      <w:r>
+        <w:t>, 2026a). La migración se aplica con un bloqueo exclusivo y la API se niega a arrancar si la versión del esquema no coincide. Se corrigieron tres defectos del módulo recibido: tipos incompatibles en funciones, procesos manuales que no se iniciaban y llaves foráneas sin índice.</w:t>
       </w:r>
     </w:p>
     <w:p>
@@ -2449,7 +2614,39 @@
         <w:t xml:space="preserve">OE2, API de administración (cumplido): </w:t>
       </w:r>
       <w:r>
-        <w:t>la aprobación de una empresa abre su periodo de prueba de 30 días. Se agregaron 8 endpoints propios bajo /admin/panel (resumen, empresas, usuarios, auditoría, salud de clientes, buscador, registro de acceso y desactivación de usuarios) y se integraron los 20 endpoints de la Consola Interna (Alloxentric, 2026c). Siete de los ocho requerimientos de Gonzalo Vera están completos; en las métricas SaaS falta el tiempo de uso (Vera, 2026).</w:t>
+        <w:t xml:space="preserve">la aprobación de una empresa abre su periodo de prueba de 30 días. Se agregaron 8 </w:t>
+      </w:r>
+      <w:proofErr w:type="spellStart"/>
+      <w:r>
+        <w:t>endpoints</w:t>
+      </w:r>
+      <w:proofErr w:type="spellEnd"/>
+      <w:r>
+        <w:t xml:space="preserve"> propios bajo /</w:t>
+      </w:r>
+      <w:proofErr w:type="spellStart"/>
+      <w:r>
+        <w:t>admin</w:t>
+      </w:r>
+      <w:proofErr w:type="spellEnd"/>
+      <w:r>
+        <w:t xml:space="preserve">/panel (resumen, empresas, usuarios, auditoría, salud de clientes, buscador, registro de acceso y desactivación de usuarios) y se integraron los 20 </w:t>
+      </w:r>
+      <w:proofErr w:type="spellStart"/>
+      <w:r>
+        <w:t>endpoints</w:t>
+      </w:r>
+      <w:proofErr w:type="spellEnd"/>
+      <w:r>
+        <w:t xml:space="preserve"> de la Consola Interna (</w:t>
+      </w:r>
+      <w:proofErr w:type="spellStart"/>
+      <w:r>
+        <w:t>Alloxentric</w:t>
+      </w:r>
+      <w:proofErr w:type="spellEnd"/>
+      <w:r>
+        <w:t>, 2026c). Siete de los ocho requerimientos de Gonzalo Vera están completos; en las métricas SaaS falta el tiempo de uso (Vera, 2026).</w:t>
       </w:r>
     </w:p>
     <w:p>
@@ -2468,7 +2665,15 @@
         <w:t xml:space="preserve">OE3, suscripciones y pagos (cumplido, con ajustes): </w:t>
       </w:r>
       <w:r>
-        <w:t>funciona el ciclo prueba, activa, morosa y cancelada. Un proceso diario emite las facturas en UF, renueva los periodos y marca la morosidad; tras 7 días de gracia la empresa queda en solo lectura. El pago se concilia con una pasarela simulada que usa el mismo proceso que el webhook real.</w:t>
+        <w:t xml:space="preserve">funciona el ciclo prueba, activa, morosa y cancelada. Un proceso diario emite las facturas en UF, renueva los periodos y marca la morosidad; tras 7 días de gracia la empresa queda en solo lectura. El pago se concilia con una pasarela simulada que usa el mismo proceso que el </w:t>
+      </w:r>
+      <w:proofErr w:type="spellStart"/>
+      <w:r>
+        <w:t>webhook</w:t>
+      </w:r>
+      <w:proofErr w:type="spellEnd"/>
+      <w:r>
+        <w:t xml:space="preserve"> real.</w:t>
       </w:r>
     </w:p>
     <w:p>
@@ -2484,10 +2689,32 @@
         <w:rPr>
           <w:b/>
         </w:rPr>
-        <w:t xml:space="preserve">OE4, frontend (avanzado): </w:t>
-      </w:r>
-      <w:r>
-        <w:t>la consola /ops tiene vistas de resumen, empresas, cobranza, salud de clientes, usuarios, auditoría, accesos, buscador, indicadores y sistemas; el portal tiene la pantalla de suscripción y el aviso de morosidad. Faltan las pantallas de planes y catálogos.</w:t>
+        <w:t xml:space="preserve">OE4, </w:t>
+      </w:r>
+      <w:proofErr w:type="spellStart"/>
+      <w:r>
+        <w:rPr>
+          <w:b/>
+        </w:rPr>
+        <w:t>frontend</w:t>
+      </w:r>
+      <w:proofErr w:type="spellEnd"/>
+      <w:r>
+        <w:rPr>
+          <w:b/>
+        </w:rPr>
+        <w:t xml:space="preserve"> (avanzado): </w:t>
+      </w:r>
+      <w:r>
+        <w:t>la consola /</w:t>
+      </w:r>
+      <w:proofErr w:type="spellStart"/>
+      <w:r>
+        <w:t>ops</w:t>
+      </w:r>
+      <w:proofErr w:type="spellEnd"/>
+      <w:r>
+        <w:t xml:space="preserve"> tiene vistas de resumen, empresas, cobranza, salud de clientes, usuarios, auditoría, accesos, buscador, indicadores y sistemas; el portal tiene la pantalla de suscripción y el aviso de morosidad. Faltan las pantallas de planes y catálogos.</w:t>
       </w:r>
     </w:p>
     <w:p>
@@ -2506,7 +2733,31 @@
         <w:t xml:space="preserve">OE5, pruebas y despliegue (en curso): </w:t>
       </w:r>
       <w:r>
-        <w:t>la plataforma completa se levanta con Docker Compose y aprueba 339 pruebas automatizadas, 65 de ellas de los módulos propios. El MVP se publicó por internet con Ngrok; el despliegue en Azure y Vercel está preparado y pendiente.</w:t>
+        <w:t xml:space="preserve">la plataforma completa se levanta con Docker </w:t>
+      </w:r>
+      <w:proofErr w:type="spellStart"/>
+      <w:r>
+        <w:t>Compose</w:t>
+      </w:r>
+      <w:proofErr w:type="spellEnd"/>
+      <w:r>
+        <w:t xml:space="preserve"> y aprueba 339 pruebas automatizadas, 65 de ellas de los módulos propios. El MVP se publicó por internet con </w:t>
+      </w:r>
+      <w:proofErr w:type="spellStart"/>
+      <w:r>
+        <w:t>Ngrok</w:t>
+      </w:r>
+      <w:proofErr w:type="spellEnd"/>
+      <w:r>
+        <w:t xml:space="preserve">; el despliegue en Azure y </w:t>
+      </w:r>
+      <w:proofErr w:type="spellStart"/>
+      <w:r>
+        <w:t>Vercel</w:t>
+      </w:r>
+      <w:proofErr w:type="spellEnd"/>
+      <w:r>
+        <w:t xml:space="preserve"> está preparado y pendiente.</w:t>
       </w:r>
     </w:p>
     <w:p>
@@ -2531,7 +2782,31 @@
         <w:t xml:space="preserve">Objetivo general: </w:t>
       </w:r>
       <w:r>
-        <w:t>desarrollar el backend y el frontend del módulo de administración del negocio de Acredittia, integrando a la plataforma la gestión de empresas y catálogos, el ciclo de suscripciones y pagos, y una consola interna de administración con auditoría de accesos.</w:t>
+        <w:t xml:space="preserve">desarrollar el </w:t>
+      </w:r>
+      <w:proofErr w:type="spellStart"/>
+      <w:r>
+        <w:t>backend</w:t>
+      </w:r>
+      <w:proofErr w:type="spellEnd"/>
+      <w:r>
+        <w:t xml:space="preserve"> y el </w:t>
+      </w:r>
+      <w:proofErr w:type="spellStart"/>
+      <w:r>
+        <w:t>frontend</w:t>
+      </w:r>
+      <w:proofErr w:type="spellEnd"/>
+      <w:r>
+        <w:t xml:space="preserve"> del módulo de administración del negocio de </w:t>
+      </w:r>
+      <w:proofErr w:type="spellStart"/>
+      <w:r>
+        <w:t>Acredittia</w:t>
+      </w:r>
+      <w:proofErr w:type="spellEnd"/>
+      <w:r>
+        <w:t>, integrando a la plataforma la gestión de empresas y catálogos, el ciclo de suscripciones y pagos, y una consola interna de administración con auditoría de accesos.</w:t>
       </w:r>
     </w:p>
     <w:p>
@@ -2556,7 +2831,15 @@
         <w:jc w:val="both"/>
       </w:pPr>
       <w:r>
-        <w:t>Extender el modelo de datos (esquema SQL versionado y ORM en SQLAlchemy) para soportar la consola interna, la auditoría y el ciclo de cobro, manteniendo el aislamiento entre empresas.</w:t>
+        <w:t xml:space="preserve">Extender el modelo de datos (esquema SQL versionado y ORM en </w:t>
+      </w:r>
+      <w:proofErr w:type="spellStart"/>
+      <w:r>
+        <w:t>SQLAlchemy</w:t>
+      </w:r>
+      <w:proofErr w:type="spellEnd"/>
+      <w:r>
+        <w:t>) para soportar la consola interna, la auditoría y el ciclo de cobro, manteniendo el aislamiento entre empresas.</w:t>
       </w:r>
     </w:p>
     <w:p>
@@ -2582,7 +2865,15 @@
         <w:jc w:val="both"/>
       </w:pPr>
       <w:r>
-        <w:t>Implementar el ciclo de suscripciones con facturación periódica, conciliación de pagos por webhook y solo lectura por morosidad.</w:t>
+        <w:t xml:space="preserve">Implementar el ciclo de suscripciones con facturación periódica, conciliación de pagos por </w:t>
+      </w:r>
+      <w:proofErr w:type="spellStart"/>
+      <w:r>
+        <w:t>webhook</w:t>
+      </w:r>
+      <w:proofErr w:type="spellEnd"/>
+      <w:r>
+        <w:t xml:space="preserve"> y solo lectura por morosidad.</w:t>
       </w:r>
     </w:p>
     <w:p>
@@ -2595,7 +2886,15 @@
         <w:jc w:val="both"/>
       </w:pPr>
       <w:r>
-        <w:t>Desarrollar el frontend: consola interna y pantallas de suscripción, pago y aviso de morosidad del portal.</w:t>
+        <w:t xml:space="preserve">Desarrollar el </w:t>
+      </w:r>
+      <w:proofErr w:type="spellStart"/>
+      <w:r>
+        <w:t>frontend</w:t>
+      </w:r>
+      <w:proofErr w:type="spellEnd"/>
+      <w:r>
+        <w:t>: consola interna y pantallas de suscripción, pago y aviso de morosidad del portal.</w:t>
       </w:r>
     </w:p>
     <w:p>
@@ -2623,7 +2922,39 @@
         <w:t xml:space="preserve">Ajuste y justificación. </w:t>
       </w:r>
       <w:r>
-        <w:t>En la Fase 1 los objetivos cubrían solo el backend y planteaban construir el modelo ORM desde cero. Se ajustaron por dos razones. Primero, Duoc UC sugirió desarrollar backend y frontend, y Alloxentric lo aceptó. Segundo, la plataforma base ya incluía el ORM y un esquema versionado por scripts SQL, por lo que el trabajo real es extenderlos. El objetivo de auditoría de la Fase 1 se integró al OE2, y se agregó el OE5 de pruebas y despliegue.</w:t>
+        <w:t xml:space="preserve">En la Fase 1 los objetivos cubrían solo el </w:t>
+      </w:r>
+      <w:proofErr w:type="spellStart"/>
+      <w:r>
+        <w:t>backend</w:t>
+      </w:r>
+      <w:proofErr w:type="spellEnd"/>
+      <w:r>
+        <w:t xml:space="preserve"> y planteaban construir el modelo ORM desde cero. Se ajustaron por dos razones. Primero, Duoc UC sugirió desarrollar </w:t>
+      </w:r>
+      <w:proofErr w:type="spellStart"/>
+      <w:r>
+        <w:t>backend</w:t>
+      </w:r>
+      <w:proofErr w:type="spellEnd"/>
+      <w:r>
+        <w:t xml:space="preserve"> y </w:t>
+      </w:r>
+      <w:proofErr w:type="spellStart"/>
+      <w:r>
+        <w:t>frontend</w:t>
+      </w:r>
+      <w:proofErr w:type="spellEnd"/>
+      <w:r>
+        <w:t xml:space="preserve">, y </w:t>
+      </w:r>
+      <w:proofErr w:type="spellStart"/>
+      <w:r>
+        <w:t>Alloxentric</w:t>
+      </w:r>
+      <w:proofErr w:type="spellEnd"/>
+      <w:r>
+        <w:t xml:space="preserve"> lo aceptó. Segundo, la plataforma base ya incluía el ORM y un esquema versionado por scripts SQL, por lo que el trabajo real es extenderlos. El objetivo de auditoría de la Fase 1 se integró al OE2, y se agregó el OE5 de pruebas y despliegue.</w:t>
       </w:r>
     </w:p>
     <w:p>
@@ -2810,11 +3141,19 @@
             <w:vAlign w:val="center"/>
           </w:tcPr>
           <w:p>
-            <w:r>
-              <w:rPr>
-                <w:sz w:val="18"/>
-              </w:rPr>
-              <w:t>Dashboard global</w:t>
+            <w:proofErr w:type="spellStart"/>
+            <w:r>
+              <w:rPr>
+                <w:sz w:val="18"/>
+              </w:rPr>
+              <w:t>Dashboard</w:t>
+            </w:r>
+            <w:proofErr w:type="spellEnd"/>
+            <w:r>
+              <w:rPr>
+                <w:sz w:val="18"/>
+              </w:rPr>
+              <w:t xml:space="preserve"> global</w:t>
             </w:r>
           </w:p>
         </w:tc>
@@ -4092,8 +4431,13 @@
         <w:spacing w:after="80"/>
         <w:jc w:val="both"/>
       </w:pPr>
-      <w:r>
-        <w:t>Sprints de 2 semanas en la Fase 2 (semanas 5 a 15), cada uno cerrado con un incremento funcionando.</w:t>
+      <w:proofErr w:type="spellStart"/>
+      <w:r>
+        <w:t>Sprints</w:t>
+      </w:r>
+      <w:proofErr w:type="spellEnd"/>
+      <w:r>
+        <w:t xml:space="preserve"> de 2 semanas en la Fase 2 (semanas 5 a 15), cada uno cerrado con un incremento funcionando.</w:t>
       </w:r>
     </w:p>
     <w:p>
@@ -4132,7 +4476,31 @@
         <w:jc w:val="both"/>
       </w:pPr>
       <w:r>
-        <w:t>Integración por ramas: cada funcionalidad se desarrolla en su rama y se fusiona a main solo si pasa la suite de pruebas. Las ramas requerimientos-gonzalo y correcciones-revision son ejemplos ya fusionados.</w:t>
+        <w:t xml:space="preserve">Integración por ramas: cada funcionalidad se desarrolla en su rama y se fusiona a </w:t>
+      </w:r>
+      <w:proofErr w:type="spellStart"/>
+      <w:r>
+        <w:t>main</w:t>
+      </w:r>
+      <w:proofErr w:type="spellEnd"/>
+      <w:r>
+        <w:t xml:space="preserve"> solo si pasa la suite de pruebas. Las ramas requerimientos-</w:t>
+      </w:r>
+      <w:proofErr w:type="spellStart"/>
+      <w:r>
+        <w:t>gonzalo</w:t>
+      </w:r>
+      <w:proofErr w:type="spellEnd"/>
+      <w:r>
+        <w:t xml:space="preserve"> y correcciones-</w:t>
+      </w:r>
+      <w:proofErr w:type="spellStart"/>
+      <w:r>
+        <w:t>revision</w:t>
+      </w:r>
+      <w:proofErr w:type="spellEnd"/>
+      <w:r>
+        <w:t xml:space="preserve"> son ejemplos ya fusionados.</w:t>
       </w:r>
     </w:p>
     <w:p>
@@ -4147,7 +4515,31 @@
         <w:t xml:space="preserve">Evidencia de aplicación. </w:t>
       </w:r>
       <w:r>
-        <w:t>El incremento entregado es el MVP funcionando (consola y portal). El seguimiento del avance se registra en las reuniones del equipo y en el historial del repositorio: ramas, commits e integraciones a main. No se usó un tablero ni un gráfico de burndown.</w:t>
+        <w:t xml:space="preserve">El incremento entregado es el MVP funcionando (consola y portal). El seguimiento del avance se registra en las reuniones del equipo y en el historial del repositorio: ramas, </w:t>
+      </w:r>
+      <w:proofErr w:type="spellStart"/>
+      <w:r>
+        <w:t>commits</w:t>
+      </w:r>
+      <w:proofErr w:type="spellEnd"/>
+      <w:r>
+        <w:t xml:space="preserve"> e integraciones a </w:t>
+      </w:r>
+      <w:proofErr w:type="spellStart"/>
+      <w:r>
+        <w:t>main</w:t>
+      </w:r>
+      <w:proofErr w:type="spellEnd"/>
+      <w:r>
+        <w:t xml:space="preserve">. No se usó un tablero ni un gráfico de </w:t>
+      </w:r>
+      <w:proofErr w:type="spellStart"/>
+      <w:r>
+        <w:t>burndown</w:t>
+      </w:r>
+      <w:proofErr w:type="spellEnd"/>
+      <w:r>
+        <w:t>.</w:t>
       </w:r>
     </w:p>
     <w:p>
@@ -4177,7 +4569,23 @@
         <w:jc w:val="both"/>
       </w:pPr>
       <w:r>
-        <w:t>La plataforma completa corre en Docker Compose con siete servicios. El navegador llama a /api en el mismo origen y Next.js reenvía esas llamadas a la API; los trabajos programados, como el ciclo de cobro diario, pasan por una cola en Redis (Alloxentric, 2026b).</w:t>
+        <w:t xml:space="preserve">La plataforma completa corre en Docker </w:t>
+      </w:r>
+      <w:proofErr w:type="spellStart"/>
+      <w:r>
+        <w:t>Compose</w:t>
+      </w:r>
+      <w:proofErr w:type="spellEnd"/>
+      <w:r>
+        <w:t xml:space="preserve"> con siete servicios. El navegador llama a /api en el mismo origen y Next.js reenvía esas llamadas a la API; los trabajos programados, como el ciclo de cobro diario, pasan por una cola en Redis (</w:t>
+      </w:r>
+      <w:proofErr w:type="spellStart"/>
+      <w:r>
+        <w:t>Alloxentric</w:t>
+      </w:r>
+      <w:proofErr w:type="spellEnd"/>
+      <w:r>
+        <w:t>, 2026b).</w:t>
       </w:r>
     </w:p>
     <w:tbl>
@@ -4342,7 +4750,35 @@
               <w:rPr>
                 <w:sz w:val="18"/>
               </w:rPr>
-              <w:t>Portal de las contratistas y consola /ops (Vercel, s.f.)</w:t>
+              <w:t>Portal de las contratistas y consola /</w:t>
+            </w:r>
+            <w:proofErr w:type="spellStart"/>
+            <w:r>
+              <w:rPr>
+                <w:sz w:val="18"/>
+              </w:rPr>
+              <w:t>ops</w:t>
+            </w:r>
+            <w:proofErr w:type="spellEnd"/>
+            <w:r>
+              <w:rPr>
+                <w:sz w:val="18"/>
+              </w:rPr>
+              <w:t xml:space="preserve"> (</w:t>
+            </w:r>
+            <w:proofErr w:type="spellStart"/>
+            <w:r>
+              <w:rPr>
+                <w:sz w:val="18"/>
+              </w:rPr>
+              <w:t>Vercel</w:t>
+            </w:r>
+            <w:proofErr w:type="spellEnd"/>
+            <w:r>
+              <w:rPr>
+                <w:sz w:val="18"/>
+              </w:rPr>
+              <w:t>, s.f.)</w:t>
             </w:r>
           </w:p>
         </w:tc>
@@ -4383,11 +4819,19 @@
             <w:vAlign w:val="center"/>
           </w:tcPr>
           <w:p>
-            <w:r>
-              <w:rPr>
-                <w:sz w:val="18"/>
-              </w:rPr>
-              <w:t>FastAPI (puerto 8000)</w:t>
+            <w:proofErr w:type="spellStart"/>
+            <w:r>
+              <w:rPr>
+                <w:sz w:val="18"/>
+              </w:rPr>
+              <w:t>FastAPI</w:t>
+            </w:r>
+            <w:proofErr w:type="spellEnd"/>
+            <w:r>
+              <w:rPr>
+                <w:sz w:val="18"/>
+              </w:rPr>
+              <w:t xml:space="preserve"> (puerto 8000)</w:t>
             </w:r>
           </w:p>
         </w:tc>
@@ -4428,12 +4872,14 @@
             <w:vAlign w:val="center"/>
           </w:tcPr>
           <w:p>
+            <w:proofErr w:type="spellStart"/>
             <w:r>
               <w:rPr>
                 <w:sz w:val="18"/>
               </w:rPr>
               <w:t>db</w:t>
             </w:r>
+            <w:proofErr w:type="spellEnd"/>
           </w:p>
         </w:tc>
         <w:tc>
@@ -4493,12 +4939,14 @@
             <w:vAlign w:val="center"/>
           </w:tcPr>
           <w:p>
+            <w:proofErr w:type="spellStart"/>
             <w:r>
               <w:rPr>
                 <w:sz w:val="18"/>
               </w:rPr>
               <w:t>migrate</w:t>
             </w:r>
+            <w:proofErr w:type="spellEnd"/>
           </w:p>
         </w:tc>
         <w:tc>
@@ -4558,12 +5006,14 @@
             <w:vAlign w:val="center"/>
           </w:tcPr>
           <w:p>
+            <w:proofErr w:type="spellStart"/>
             <w:r>
               <w:rPr>
                 <w:sz w:val="18"/>
               </w:rPr>
               <w:t>redis</w:t>
             </w:r>
+            <w:proofErr w:type="spellEnd"/>
           </w:p>
         </w:tc>
         <w:tc>
@@ -4623,12 +5073,14 @@
             <w:vAlign w:val="center"/>
           </w:tcPr>
           <w:p>
+            <w:proofErr w:type="spellStart"/>
             <w:r>
               <w:rPr>
                 <w:sz w:val="18"/>
               </w:rPr>
               <w:t>worker</w:t>
             </w:r>
+            <w:proofErr w:type="spellEnd"/>
           </w:p>
         </w:tc>
         <w:tc>
@@ -4643,12 +5095,14 @@
             <w:vAlign w:val="center"/>
           </w:tcPr>
           <w:p>
+            <w:proofErr w:type="spellStart"/>
             <w:r>
               <w:rPr>
                 <w:sz w:val="18"/>
               </w:rPr>
               <w:t>Celery</w:t>
             </w:r>
+            <w:proofErr w:type="spellEnd"/>
           </w:p>
         </w:tc>
         <w:tc>
@@ -4708,11 +5162,19 @@
             <w:vAlign w:val="center"/>
           </w:tcPr>
           <w:p>
-            <w:r>
-              <w:rPr>
-                <w:sz w:val="18"/>
-              </w:rPr>
-              <w:t>Celery beat</w:t>
+            <w:proofErr w:type="spellStart"/>
+            <w:r>
+              <w:rPr>
+                <w:sz w:val="18"/>
+              </w:rPr>
+              <w:t>Celery</w:t>
+            </w:r>
+            <w:proofErr w:type="spellEnd"/>
+            <w:r>
+              <w:rPr>
+                <w:sz w:val="18"/>
+              </w:rPr>
+              <w:t xml:space="preserve"> beat</w:t>
             </w:r>
           </w:p>
         </w:tc>
@@ -4806,7 +5268,21 @@
         <w:rPr>
           <w:sz w:val="18"/>
         </w:rPr>
-        <w:t>Arquitectura actual: servicios de Docker Compose y su comunicación.</w:t>
+        <w:t xml:space="preserve">Arquitectura actual: servicios de Docker </w:t>
+      </w:r>
+      <w:proofErr w:type="spellStart"/>
+      <w:r>
+        <w:rPr>
+          <w:sz w:val="18"/>
+        </w:rPr>
+        <w:t>Compose</w:t>
+      </w:r>
+      <w:proofErr w:type="spellEnd"/>
+      <w:r>
+        <w:rPr>
+          <w:sz w:val="18"/>
+        </w:rPr>
+        <w:t xml:space="preserve"> y su comunicación.</w:t>
       </w:r>
     </w:p>
     <w:p>
@@ -4821,7 +5297,15 @@
         <w:t xml:space="preserve">Hoy: </w:t>
       </w:r>
       <w:r>
-        <w:t xml:space="preserve">el MVP está publicado por internet con Ngrok sobre este mismo entorno Docker. </w:t>
+        <w:t xml:space="preserve">el MVP está publicado por internet con </w:t>
+      </w:r>
+      <w:proofErr w:type="spellStart"/>
+      <w:r>
+        <w:t>Ngrok</w:t>
+      </w:r>
+      <w:proofErr w:type="spellEnd"/>
+      <w:r>
+        <w:t xml:space="preserve"> sobre este mismo entorno Docker. </w:t>
       </w:r>
       <w:r>
         <w:rPr>
@@ -4829,8 +5313,29 @@
         </w:rPr>
         <w:t xml:space="preserve">Destino previsto (H3): </w:t>
       </w:r>
-      <w:r>
-        <w:t>backend en Azure Container Apps y frontend en Vercel.</w:t>
+      <w:proofErr w:type="spellStart"/>
+      <w:r>
+        <w:t>backend</w:t>
+      </w:r>
+      <w:proofErr w:type="spellEnd"/>
+      <w:r>
+        <w:t xml:space="preserve"> en Azure Container Apps y </w:t>
+      </w:r>
+      <w:proofErr w:type="spellStart"/>
+      <w:r>
+        <w:t>frontend</w:t>
+      </w:r>
+      <w:proofErr w:type="spellEnd"/>
+      <w:r>
+        <w:t xml:space="preserve"> en </w:t>
+      </w:r>
+      <w:proofErr w:type="spellStart"/>
+      <w:r>
+        <w:t>Vercel</w:t>
+      </w:r>
+      <w:proofErr w:type="spellEnd"/>
+      <w:r>
+        <w:t>.</w:t>
       </w:r>
     </w:p>
     <w:p>
@@ -4859,7 +5364,39 @@
         <w:t xml:space="preserve">Implementado: </w:t>
       </w:r>
       <w:r>
-        <w:t>esquema en versión 7 con 45 tablas, definido en los scripts numerados modelo_datos/01 a 08 (Alloxentric, 2026a). Los scripts 07 y 08 son los de la Consola Interna: tablas ops_* y funciones de agregación en PL/pgSQL.</w:t>
+        <w:t xml:space="preserve">esquema en versión 7 con 45 tablas, definido en los scripts numerados </w:t>
+      </w:r>
+      <w:proofErr w:type="spellStart"/>
+      <w:r>
+        <w:t>modelo_datos</w:t>
+      </w:r>
+      <w:proofErr w:type="spellEnd"/>
+      <w:r>
+        <w:t>/01 a 08 (</w:t>
+      </w:r>
+      <w:proofErr w:type="spellStart"/>
+      <w:r>
+        <w:t>Alloxentric</w:t>
+      </w:r>
+      <w:proofErr w:type="spellEnd"/>
+      <w:r>
+        <w:t xml:space="preserve">, 2026a). Los scripts 07 y 08 son los de la Consola Interna: tablas </w:t>
+      </w:r>
+      <w:proofErr w:type="spellStart"/>
+      <w:r>
+        <w:t>ops</w:t>
+      </w:r>
+      <w:proofErr w:type="spellEnd"/>
+      <w:r>
+        <w:t>_* y funciones de agregación en PL/</w:t>
+      </w:r>
+      <w:proofErr w:type="spellStart"/>
+      <w:r>
+        <w:t>pgSQL</w:t>
+      </w:r>
+      <w:proofErr w:type="spellEnd"/>
+      <w:r>
+        <w:t>.</w:t>
       </w:r>
     </w:p>
     <w:p>
@@ -4878,7 +5415,15 @@
         <w:t xml:space="preserve">Migraciones: </w:t>
       </w:r>
       <w:r>
-        <w:t>el servicio migrate aplica los scripts en orden; la API verifica la versión al arrancar.</w:t>
+        <w:t xml:space="preserve">el servicio </w:t>
+      </w:r>
+      <w:proofErr w:type="spellStart"/>
+      <w:r>
+        <w:t>migrate</w:t>
+      </w:r>
+      <w:proofErr w:type="spellEnd"/>
+      <w:r>
+        <w:t xml:space="preserve"> aplica los scripts en orden; la API verifica la versión al arrancar.</w:t>
       </w:r>
     </w:p>
     <w:p>
@@ -4897,7 +5442,31 @@
         <w:t xml:space="preserve">Aislamiento: </w:t>
       </w:r>
       <w:r>
-        <w:t>seguridad a nivel de fila (RLS) de PostgreSQL por empresa (PostgreSQL Global Development Group, 2023), sobre el ORM en SQLAlchemy (SQLAlchemy, s.f.).</w:t>
+        <w:t xml:space="preserve">seguridad a nivel de fila (RLS) de PostgreSQL por empresa (PostgreSQL Global </w:t>
+      </w:r>
+      <w:proofErr w:type="spellStart"/>
+      <w:r>
+        <w:t>Development</w:t>
+      </w:r>
+      <w:proofErr w:type="spellEnd"/>
+      <w:r>
+        <w:t xml:space="preserve"> Group, 2023), sobre el ORM en </w:t>
+      </w:r>
+      <w:proofErr w:type="spellStart"/>
+      <w:r>
+        <w:t>SQLAlchemy</w:t>
+      </w:r>
+      <w:proofErr w:type="spellEnd"/>
+      <w:r>
+        <w:t xml:space="preserve"> (</w:t>
+      </w:r>
+      <w:proofErr w:type="spellStart"/>
+      <w:r>
+        <w:t>SQLAlchemy</w:t>
+      </w:r>
+      <w:proofErr w:type="spellEnd"/>
+      <w:r>
+        <w:t>, s.f.).</w:t>
       </w:r>
     </w:p>
     <w:p>
@@ -4983,7 +5552,35 @@
         <w:rPr>
           <w:sz w:val="18"/>
         </w:rPr>
-        <w:t>Tablas del módulo y sus relaciones, obtenidas de las claves foráneas de modelo_datos/*.sql. En azul, las tablas del módulo; con borde, las tablas base relacionadas.</w:t>
+        <w:t xml:space="preserve">Tablas del módulo y sus relaciones, obtenidas de las claves foráneas de </w:t>
+      </w:r>
+      <w:proofErr w:type="spellStart"/>
+      <w:r>
+        <w:rPr>
+          <w:sz w:val="18"/>
+        </w:rPr>
+        <w:t>modelo_datos</w:t>
+      </w:r>
+      <w:proofErr w:type="spellEnd"/>
+      <w:r>
+        <w:rPr>
+          <w:sz w:val="18"/>
+        </w:rPr>
+        <w:t>/*.</w:t>
+      </w:r>
+      <w:proofErr w:type="spellStart"/>
+      <w:r>
+        <w:rPr>
+          <w:sz w:val="18"/>
+        </w:rPr>
+        <w:t>sql</w:t>
+      </w:r>
+      <w:proofErr w:type="spellEnd"/>
+      <w:r>
+        <w:rPr>
+          <w:sz w:val="18"/>
+        </w:rPr>
+        <w:t>. En azul, las tablas del módulo; con borde, las tablas base relacionadas.</w:t>
       </w:r>
     </w:p>
     <w:p>
@@ -5012,7 +5609,47 @@
         <w:t xml:space="preserve">Pruebas: </w:t>
       </w:r>
       <w:r>
-        <w:t>339 pruebas automatizadas del backend, todas aprobadas en la corrida del 14 de octubre. 65 son de los módulos propios: test_cobranza (18), test_ops (21), test_admin_panel (16) y test_auditoria_accesos (10). También hay pruebas de aislamiento entre empresas y de integridad del esquema.</w:t>
+        <w:t xml:space="preserve">339 pruebas automatizadas del </w:t>
+      </w:r>
+      <w:proofErr w:type="spellStart"/>
+      <w:r>
+        <w:t>backend</w:t>
+      </w:r>
+      <w:proofErr w:type="spellEnd"/>
+      <w:r>
+        <w:t xml:space="preserve">, todas aprobadas en la corrida del 14 de octubre. 65 son de los módulos propios: </w:t>
+      </w:r>
+      <w:proofErr w:type="spellStart"/>
+      <w:r>
+        <w:t>test_cobranza</w:t>
+      </w:r>
+      <w:proofErr w:type="spellEnd"/>
+      <w:r>
+        <w:t xml:space="preserve"> (18), </w:t>
+      </w:r>
+      <w:proofErr w:type="spellStart"/>
+      <w:r>
+        <w:t>test_ops</w:t>
+      </w:r>
+      <w:proofErr w:type="spellEnd"/>
+      <w:r>
+        <w:t xml:space="preserve"> (21), </w:t>
+      </w:r>
+      <w:proofErr w:type="spellStart"/>
+      <w:r>
+        <w:t>test_admin_panel</w:t>
+      </w:r>
+      <w:proofErr w:type="spellEnd"/>
+      <w:r>
+        <w:t xml:space="preserve"> (16) y </w:t>
+      </w:r>
+      <w:proofErr w:type="spellStart"/>
+      <w:r>
+        <w:t>test_auditoria_accesos</w:t>
+      </w:r>
+      <w:proofErr w:type="spellEnd"/>
+      <w:r>
+        <w:t xml:space="preserve"> (10). También hay pruebas de aislamiento entre empresas y de integridad del esquema.</w:t>
       </w:r>
     </w:p>
     <w:p>
@@ -5047,10 +5684,48 @@
         <w:rPr>
           <w:b/>
         </w:rPr>
-        <w:t xml:space="preserve">Verificación del frontend: </w:t>
-      </w:r>
-      <w:r>
-        <w:t>la compilación de producción (next build) revisa los tipos de TypeScript.</w:t>
+        <w:t xml:space="preserve">Verificación del </w:t>
+      </w:r>
+      <w:proofErr w:type="spellStart"/>
+      <w:r>
+        <w:rPr>
+          <w:b/>
+        </w:rPr>
+        <w:t>frontend</w:t>
+      </w:r>
+      <w:proofErr w:type="spellEnd"/>
+      <w:r>
+        <w:rPr>
+          <w:b/>
+        </w:rPr>
+        <w:t xml:space="preserve">: </w:t>
+      </w:r>
+      <w:r>
+        <w:t>la compilación de producción (</w:t>
+      </w:r>
+      <w:proofErr w:type="spellStart"/>
+      <w:r>
+        <w:t>next</w:t>
+      </w:r>
+      <w:proofErr w:type="spellEnd"/>
+      <w:r>
+        <w:t xml:space="preserve"> </w:t>
+      </w:r>
+      <w:proofErr w:type="spellStart"/>
+      <w:r>
+        <w:t>build</w:t>
+      </w:r>
+      <w:proofErr w:type="spellEnd"/>
+      <w:r>
+        <w:t xml:space="preserve">) revisa los tipos de </w:t>
+      </w:r>
+      <w:proofErr w:type="spellStart"/>
+      <w:r>
+        <w:t>TypeScript</w:t>
+      </w:r>
+      <w:proofErr w:type="spellEnd"/>
+      <w:r>
+        <w:t>.</w:t>
       </w:r>
     </w:p>
     <w:p>
@@ -5069,7 +5744,15 @@
         <w:t xml:space="preserve">Estrategia de ramas: </w:t>
       </w:r>
       <w:r>
-        <w:t>una rama por funcionalidad, fusionada a main solo después de pasar la suite.</w:t>
+        <w:t xml:space="preserve">una rama por funcionalidad, fusionada a </w:t>
+      </w:r>
+      <w:proofErr w:type="spellStart"/>
+      <w:r>
+        <w:t>main</w:t>
+      </w:r>
+      <w:proofErr w:type="spellEnd"/>
+      <w:r>
+        <w:t xml:space="preserve"> solo después de pasar la suite.</w:t>
       </w:r>
     </w:p>
     <w:p>
@@ -5107,7 +5790,39 @@
         <w:t xml:space="preserve">Pendiente: </w:t>
       </w:r>
       <w:r>
-        <w:t>no hay linter configurado ni se han usado pull requests; la fusión a main del 14 de octubre se hizo de forma local.</w:t>
+        <w:t xml:space="preserve">no hay </w:t>
+      </w:r>
+      <w:proofErr w:type="spellStart"/>
+      <w:r>
+        <w:t>linter</w:t>
+      </w:r>
+      <w:proofErr w:type="spellEnd"/>
+      <w:r>
+        <w:t xml:space="preserve"> configurado ni se han usado </w:t>
+      </w:r>
+      <w:proofErr w:type="spellStart"/>
+      <w:r>
+        <w:t>pull</w:t>
+      </w:r>
+      <w:proofErr w:type="spellEnd"/>
+      <w:r>
+        <w:t xml:space="preserve"> </w:t>
+      </w:r>
+      <w:proofErr w:type="spellStart"/>
+      <w:r>
+        <w:t>requests</w:t>
+      </w:r>
+      <w:proofErr w:type="spellEnd"/>
+      <w:r>
+        <w:t xml:space="preserve">; la fusión a </w:t>
+      </w:r>
+      <w:proofErr w:type="spellStart"/>
+      <w:r>
+        <w:t>main</w:t>
+      </w:r>
+      <w:proofErr w:type="spellEnd"/>
+      <w:r>
+        <w:t xml:space="preserve"> del 14 de octubre se hizo de forma local.</w:t>
       </w:r>
     </w:p>
     <w:p>
@@ -5594,7 +6309,21 @@
               <w:rPr>
                 <w:sz w:val="18"/>
               </w:rPr>
-              <w:t>Se extendió el esquema versionado existente en lugar de construir el ORM y migrar con Alembic.</w:t>
+              <w:t xml:space="preserve">Se extendió el esquema versionado existente en lugar de construir el ORM y migrar con </w:t>
+            </w:r>
+            <w:proofErr w:type="spellStart"/>
+            <w:r>
+              <w:rPr>
+                <w:sz w:val="18"/>
+              </w:rPr>
+              <w:t>Alembic</w:t>
+            </w:r>
+            <w:proofErr w:type="spellEnd"/>
+            <w:r>
+              <w:rPr>
+                <w:sz w:val="18"/>
+              </w:rPr>
+              <w:t>.</w:t>
             </w:r>
           </w:p>
         </w:tc>
@@ -5930,11 +6659,19 @@
             <w:vAlign w:val="center"/>
           </w:tcPr>
           <w:p>
-            <w:r>
-              <w:rPr>
-                <w:sz w:val="18"/>
-              </w:rPr>
-              <w:t>Frontend de la consola interna</w:t>
+            <w:proofErr w:type="spellStart"/>
+            <w:r>
+              <w:rPr>
+                <w:sz w:val="18"/>
+              </w:rPr>
+              <w:t>Frontend</w:t>
+            </w:r>
+            <w:proofErr w:type="spellEnd"/>
+            <w:r>
+              <w:rPr>
+                <w:sz w:val="18"/>
+              </w:rPr>
+              <w:t xml:space="preserve"> de la consola interna</w:t>
             </w:r>
           </w:p>
         </w:tc>
@@ -6035,11 +6772,19 @@
             <w:vAlign w:val="center"/>
           </w:tcPr>
           <w:p>
-            <w:r>
-              <w:rPr>
-                <w:sz w:val="18"/>
-              </w:rPr>
-              <w:t>Frontend del portal: suscripción y pagos</w:t>
+            <w:proofErr w:type="spellStart"/>
+            <w:r>
+              <w:rPr>
+                <w:sz w:val="18"/>
+              </w:rPr>
+              <w:t>Frontend</w:t>
+            </w:r>
+            <w:proofErr w:type="spellEnd"/>
+            <w:r>
+              <w:rPr>
+                <w:sz w:val="18"/>
+              </w:rPr>
+              <w:t xml:space="preserve"> del portal: suscripción y pagos</w:t>
             </w:r>
           </w:p>
         </w:tc>
@@ -6329,7 +7074,21 @@
               <w:rPr>
                 <w:sz w:val="18"/>
               </w:rPr>
-              <w:t>MVP publicado con Ngrok; Azure se recrea para el hito H3.</w:t>
+              <w:t xml:space="preserve">MVP publicado con </w:t>
+            </w:r>
+            <w:proofErr w:type="spellStart"/>
+            <w:r>
+              <w:rPr>
+                <w:sz w:val="18"/>
+              </w:rPr>
+              <w:t>Ngrok</w:t>
+            </w:r>
+            <w:proofErr w:type="spellEnd"/>
+            <w:r>
+              <w:rPr>
+                <w:sz w:val="18"/>
+              </w:rPr>
+              <w:t>; Azure se recrea para el hito H3.</w:t>
             </w:r>
           </w:p>
         </w:tc>
@@ -7043,8 +7802,16 @@
               <w:rPr>
                 <w:sz w:val="18"/>
               </w:rPr>
-              <w:t>Cumplido: MVP publicado con Ngrok</w:t>
-            </w:r>
+              <w:t xml:space="preserve">Cumplido: MVP publicado con </w:t>
+            </w:r>
+            <w:proofErr w:type="spellStart"/>
+            <w:r>
+              <w:rPr>
+                <w:sz w:val="18"/>
+              </w:rPr>
+              <w:t>Ngrok</w:t>
+            </w:r>
+            <w:proofErr w:type="spellEnd"/>
           </w:p>
         </w:tc>
       </w:tr>
@@ -7128,7 +7895,21 @@
               <w:rPr>
                 <w:sz w:val="18"/>
               </w:rPr>
-              <w:t>En curso: Docker listo; Azure y Vercel pendientes</w:t>
+              <w:t xml:space="preserve">En curso: Docker listo; Azure y </w:t>
+            </w:r>
+            <w:proofErr w:type="spellStart"/>
+            <w:r>
+              <w:rPr>
+                <w:sz w:val="18"/>
+              </w:rPr>
+              <w:t>Vercel</w:t>
+            </w:r>
+            <w:proofErr w:type="spellEnd"/>
+            <w:r>
+              <w:rPr>
+                <w:sz w:val="18"/>
+              </w:rPr>
+              <w:t xml:space="preserve"> pendientes</w:t>
             </w:r>
           </w:p>
         </w:tc>
@@ -7238,6 +8019,7 @@
               <w:rPr>
                 <w:sz w:val="18"/>
               </w:rPr>
+              <w:lastRenderedPageBreak/>
               <w:t>H5</w:t>
             </w:r>
           </w:p>
@@ -7582,7 +8364,21 @@
               <w:rPr>
                 <w:sz w:val="18"/>
               </w:rPr>
-              <w:t>Scrum adaptado: sprints de 2 semanas, seguimiento semanal, reunión semanal con la docente, revisión y retrospectiva por sprint</w:t>
+              <w:t xml:space="preserve">Scrum adaptado: </w:t>
+            </w:r>
+            <w:proofErr w:type="spellStart"/>
+            <w:r>
+              <w:rPr>
+                <w:sz w:val="18"/>
+              </w:rPr>
+              <w:t>sprints</w:t>
+            </w:r>
+            <w:proofErr w:type="spellEnd"/>
+            <w:r>
+              <w:rPr>
+                <w:sz w:val="18"/>
+              </w:rPr>
+              <w:t xml:space="preserve"> de 2 semanas, seguimiento semanal, reunión semanal con la docente, revisión y retrospectiva por sprint</w:t>
             </w:r>
           </w:p>
         </w:tc>
@@ -8072,8 +8868,16 @@
               <w:rPr>
                 <w:sz w:val="18"/>
               </w:rPr>
-              <w:t>(Plan original) construir el ORM y migrar con Alembic</w:t>
-            </w:r>
+              <w:t xml:space="preserve">(Plan original) construir el ORM y migrar con </w:t>
+            </w:r>
+            <w:proofErr w:type="spellStart"/>
+            <w:r>
+              <w:rPr>
+                <w:sz w:val="18"/>
+              </w:rPr>
+              <w:t>Alembic</w:t>
+            </w:r>
+            <w:proofErr w:type="spellEnd"/>
           </w:p>
         </w:tc>
         <w:tc>
@@ -8242,8 +9046,16 @@
               <w:rPr>
                 <w:sz w:val="18"/>
               </w:rPr>
-              <w:t>(Alcance) solo backend</w:t>
-            </w:r>
+              <w:t xml:space="preserve">(Alcance) solo </w:t>
+            </w:r>
+            <w:proofErr w:type="spellStart"/>
+            <w:r>
+              <w:rPr>
+                <w:sz w:val="18"/>
+              </w:rPr>
+              <w:t>backend</w:t>
+            </w:r>
+            <w:proofErr w:type="spellEnd"/>
           </w:p>
         </w:tc>
         <w:tc>
@@ -8262,7 +9074,21 @@
               <w:rPr>
                 <w:sz w:val="18"/>
               </w:rPr>
-              <w:t>Se agregó el frontend de la consola y del portal</w:t>
+              <w:t xml:space="preserve">Se agregó el </w:t>
+            </w:r>
+            <w:proofErr w:type="spellStart"/>
+            <w:r>
+              <w:rPr>
+                <w:sz w:val="18"/>
+              </w:rPr>
+              <w:t>frontend</w:t>
+            </w:r>
+            <w:proofErr w:type="spellEnd"/>
+            <w:r>
+              <w:rPr>
+                <w:sz w:val="18"/>
+              </w:rPr>
+              <w:t xml:space="preserve"> de la consola y del portal</w:t>
             </w:r>
           </w:p>
         </w:tc>
@@ -8302,7 +9128,21 @@
               <w:rPr>
                 <w:sz w:val="18"/>
               </w:rPr>
-              <w:t>Duoc UC lo sugirió y Alloxentric lo aceptó</w:t>
+              <w:t xml:space="preserve">Duoc UC lo sugirió y </w:t>
+            </w:r>
+            <w:proofErr w:type="spellStart"/>
+            <w:r>
+              <w:rPr>
+                <w:sz w:val="18"/>
+              </w:rPr>
+              <w:t>Alloxentric</w:t>
+            </w:r>
+            <w:proofErr w:type="spellEnd"/>
+            <w:r>
+              <w:rPr>
+                <w:sz w:val="18"/>
+              </w:rPr>
+              <w:t xml:space="preserve"> lo aceptó</w:t>
             </w:r>
           </w:p>
         </w:tc>
@@ -8347,7 +9187,21 @@
               <w:rPr>
                 <w:sz w:val="18"/>
               </w:rPr>
-              <w:t>MVP publicado con Ngrok; Azure se recrea para el hito H3</w:t>
+              <w:t xml:space="preserve">MVP publicado con </w:t>
+            </w:r>
+            <w:proofErr w:type="spellStart"/>
+            <w:r>
+              <w:rPr>
+                <w:sz w:val="18"/>
+              </w:rPr>
+              <w:t>Ngrok</w:t>
+            </w:r>
+            <w:proofErr w:type="spellEnd"/>
+            <w:r>
+              <w:rPr>
+                <w:sz w:val="18"/>
+              </w:rPr>
+              <w:t>; Azure se recrea para el hito H3</w:t>
             </w:r>
           </w:p>
         </w:tc>
@@ -8387,8 +9241,30 @@
               <w:rPr>
                 <w:sz w:val="18"/>
               </w:rPr>
-              <w:t>Crédito y restricciones de Azure for Students</w:t>
-            </w:r>
+              <w:t xml:space="preserve">Crédito y restricciones de Azure </w:t>
+            </w:r>
+            <w:proofErr w:type="spellStart"/>
+            <w:r>
+              <w:rPr>
+                <w:sz w:val="18"/>
+              </w:rPr>
+              <w:t>for</w:t>
+            </w:r>
+            <w:proofErr w:type="spellEnd"/>
+            <w:r>
+              <w:rPr>
+                <w:sz w:val="18"/>
+              </w:rPr>
+              <w:t xml:space="preserve"> </w:t>
+            </w:r>
+            <w:proofErr w:type="spellStart"/>
+            <w:r>
+              <w:rPr>
+                <w:sz w:val="18"/>
+              </w:rPr>
+              <w:t>Students</w:t>
+            </w:r>
+            <w:proofErr w:type="spellEnd"/>
           </w:p>
         </w:tc>
       </w:tr>
@@ -8457,6 +9333,7 @@
         <w:jc w:val="both"/>
       </w:pPr>
       <w:r>
+        <w:lastRenderedPageBreak/>
         <w:t>El cliente entregó ocho requerimientos claros para la consola, que sirvieron de backlog priorizado.</w:t>
       </w:r>
     </w:p>
@@ -8534,10 +9411,62 @@
         <w:rPr>
           <w:b/>
         </w:rPr>
-        <w:t xml:space="preserve">Restricciones de Azure for Students: </w:t>
-      </w:r>
-      <w:r>
-        <w:t>solo se permite una región y el proveedor de Container Apps tardó horas en habilitarse; además, el crédito no alcanza para mantener el entorno encendido. Acción: publicar el MVP con Ngrok, recrear los recursos con los scripts de app/infra/azure para el hito H3 y apagarlos entre demostraciones.</w:t>
+        <w:t xml:space="preserve">Restricciones de Azure </w:t>
+      </w:r>
+      <w:proofErr w:type="spellStart"/>
+      <w:r>
+        <w:rPr>
+          <w:b/>
+        </w:rPr>
+        <w:t>for</w:t>
+      </w:r>
+      <w:proofErr w:type="spellEnd"/>
+      <w:r>
+        <w:rPr>
+          <w:b/>
+        </w:rPr>
+        <w:t xml:space="preserve"> </w:t>
+      </w:r>
+      <w:proofErr w:type="spellStart"/>
+      <w:r>
+        <w:rPr>
+          <w:b/>
+        </w:rPr>
+        <w:t>Students</w:t>
+      </w:r>
+      <w:proofErr w:type="spellEnd"/>
+      <w:r>
+        <w:rPr>
+          <w:b/>
+        </w:rPr>
+        <w:t xml:space="preserve">: </w:t>
+      </w:r>
+      <w:r>
+        <w:t xml:space="preserve">solo se permite una región y el proveedor de Container Apps tardó horas en habilitarse; además, el crédito no alcanza para mantener el entorno encendido. Acción: publicar el MVP con </w:t>
+      </w:r>
+      <w:proofErr w:type="spellStart"/>
+      <w:r>
+        <w:t>Ngrok</w:t>
+      </w:r>
+      <w:proofErr w:type="spellEnd"/>
+      <w:r>
+        <w:t xml:space="preserve">, recrear los recursos con los scripts de </w:t>
+      </w:r>
+      <w:proofErr w:type="gramStart"/>
+      <w:r>
+        <w:t>app</w:t>
+      </w:r>
+      <w:proofErr w:type="gramEnd"/>
+      <w:r>
+        <w:t>/infra/</w:t>
+      </w:r>
+      <w:proofErr w:type="spellStart"/>
+      <w:r>
+        <w:t>azure</w:t>
+      </w:r>
+      <w:proofErr w:type="spellEnd"/>
+      <w:r>
+        <w:t xml:space="preserve"> para el hito H3 y apagarlos entre demostraciones.</w:t>
       </w:r>
     </w:p>
     <w:p>
@@ -8604,7 +9533,15 @@
         <w:t xml:space="preserve">Modelo de datos: </w:t>
       </w:r>
       <w:r>
-        <w:t>se pasó de construir el ORM y migrar con Alembic a extender el esquema versionado que ya traía la plataforma base. El código entregado ya tenía ORM y migraciones por scripts SQL; usar otra herramienta habría duplicado el control del esquema.</w:t>
+        <w:t xml:space="preserve">se pasó de construir el ORM y migrar con </w:t>
+      </w:r>
+      <w:proofErr w:type="spellStart"/>
+      <w:r>
+        <w:t>Alembic</w:t>
+      </w:r>
+      <w:proofErr w:type="spellEnd"/>
+      <w:r>
+        <w:t xml:space="preserve"> a extender el esquema versionado que ya traía la plataforma base. El código entregado ya tenía ORM y migraciones por scripts SQL; usar otra herramienta habría duplicado el control del esquema.</w:t>
       </w:r>
     </w:p>
     <w:p>
@@ -8623,7 +9560,15 @@
         <w:t xml:space="preserve">Facturación y pagos: </w:t>
       </w:r>
       <w:r>
-        <w:t>se usa una pasarela simulada en lugar de un sandbox de Transbank o Stripe. No hay credenciales disponibles, y la simulación permite probar el flujo completo con el mismo proceso de conciliación.</w:t>
+        <w:t xml:space="preserve">se usa una pasarela simulada en lugar de un </w:t>
+      </w:r>
+      <w:proofErr w:type="spellStart"/>
+      <w:r>
+        <w:t>sandbox</w:t>
+      </w:r>
+      <w:proofErr w:type="spellEnd"/>
+      <w:r>
+        <w:t xml:space="preserve"> de Transbank o Stripe. No hay credenciales disponibles, y la simulación permite probar el flujo completo con el mismo proceso de conciliación.</w:t>
       </w:r>
     </w:p>
     <w:p>
@@ -8639,10 +9584,56 @@
         <w:rPr>
           <w:b/>
         </w:rPr>
-        <w:t xml:space="preserve">Alcance de frontend: </w:t>
-      </w:r>
-      <w:r>
-        <w:t>se agregaron las actividades de frontend de la consola y del portal, porque Duoc UC sugirió desarrollar backend y frontend, y Alloxentric lo aceptó.</w:t>
+        <w:t xml:space="preserve">Alcance de </w:t>
+      </w:r>
+      <w:proofErr w:type="spellStart"/>
+      <w:r>
+        <w:rPr>
+          <w:b/>
+        </w:rPr>
+        <w:t>frontend</w:t>
+      </w:r>
+      <w:proofErr w:type="spellEnd"/>
+      <w:r>
+        <w:rPr>
+          <w:b/>
+        </w:rPr>
+        <w:t xml:space="preserve">: </w:t>
+      </w:r>
+      <w:r>
+        <w:t xml:space="preserve">se agregaron las actividades de </w:t>
+      </w:r>
+      <w:proofErr w:type="spellStart"/>
+      <w:r>
+        <w:t>frontend</w:t>
+      </w:r>
+      <w:proofErr w:type="spellEnd"/>
+      <w:r>
+        <w:t xml:space="preserve"> de la consola y del portal, porque Duoc UC sugirió desarrollar </w:t>
+      </w:r>
+      <w:proofErr w:type="spellStart"/>
+      <w:r>
+        <w:t>backend</w:t>
+      </w:r>
+      <w:proofErr w:type="spellEnd"/>
+      <w:r>
+        <w:t xml:space="preserve"> y </w:t>
+      </w:r>
+      <w:proofErr w:type="spellStart"/>
+      <w:r>
+        <w:t>frontend</w:t>
+      </w:r>
+      <w:proofErr w:type="spellEnd"/>
+      <w:r>
+        <w:t xml:space="preserve">, y </w:t>
+      </w:r>
+      <w:proofErr w:type="spellStart"/>
+      <w:r>
+        <w:t>Alloxentric</w:t>
+      </w:r>
+      <w:proofErr w:type="spellEnd"/>
+      <w:r>
+        <w:t xml:space="preserve"> lo aceptó.</w:t>
       </w:r>
     </w:p>
     <w:p>
@@ -8738,6 +9729,7 @@
         <w:jc w:val="both"/>
       </w:pPr>
       <w:r>
+        <w:lastRenderedPageBreak/>
         <w:t>PDF de las facturas y tiempo de uso en las métricas: 6 de noviembre.</w:t>
       </w:r>
     </w:p>
@@ -8764,7 +9756,15 @@
         <w:jc w:val="both"/>
       </w:pPr>
       <w:r>
-        <w:t>Despliegue en Azure y Vercel: hito H3 (semana 11).</w:t>
+        <w:t xml:space="preserve">Despliegue en Azure y </w:t>
+      </w:r>
+      <w:proofErr w:type="spellStart"/>
+      <w:r>
+        <w:t>Vercel</w:t>
+      </w:r>
+      <w:proofErr w:type="spellEnd"/>
+      <w:r>
+        <w:t>: hito H3 (semana 11).</w:t>
       </w:r>
     </w:p>
     <w:p>
@@ -8918,8 +9918,30 @@
               <w:rPr>
                 <w:sz w:val="18"/>
               </w:rPr>
-              <w:t>Crédito y restricciones de Azure for Students</w:t>
-            </w:r>
+              <w:t xml:space="preserve">Crédito y restricciones de Azure </w:t>
+            </w:r>
+            <w:proofErr w:type="spellStart"/>
+            <w:r>
+              <w:rPr>
+                <w:sz w:val="18"/>
+              </w:rPr>
+              <w:t>for</w:t>
+            </w:r>
+            <w:proofErr w:type="spellEnd"/>
+            <w:r>
+              <w:rPr>
+                <w:sz w:val="18"/>
+              </w:rPr>
+              <w:t xml:space="preserve"> </w:t>
+            </w:r>
+            <w:proofErr w:type="spellStart"/>
+            <w:r>
+              <w:rPr>
+                <w:sz w:val="18"/>
+              </w:rPr>
+              <w:t>Students</w:t>
+            </w:r>
+            <w:proofErr w:type="spellEnd"/>
           </w:p>
         </w:tc>
         <w:tc>
@@ -8938,7 +9960,49 @@
               <w:rPr>
                 <w:sz w:val="18"/>
               </w:rPr>
-              <w:t>Infraestructura recreable con scripts (app/infra/azure), apagada entre demostraciones y Ngrok como respaldo.</w:t>
+              <w:t>Infraestructura recreable con scripts (</w:t>
+            </w:r>
+            <w:proofErr w:type="gramStart"/>
+            <w:r>
+              <w:rPr>
+                <w:sz w:val="18"/>
+              </w:rPr>
+              <w:t>app</w:t>
+            </w:r>
+            <w:proofErr w:type="gramEnd"/>
+            <w:r>
+              <w:rPr>
+                <w:sz w:val="18"/>
+              </w:rPr>
+              <w:t>/infra/</w:t>
+            </w:r>
+            <w:proofErr w:type="spellStart"/>
+            <w:r>
+              <w:rPr>
+                <w:sz w:val="18"/>
+              </w:rPr>
+              <w:t>azure</w:t>
+            </w:r>
+            <w:proofErr w:type="spellEnd"/>
+            <w:r>
+              <w:rPr>
+                <w:sz w:val="18"/>
+              </w:rPr>
+              <w:t xml:space="preserve">), apagada entre demostraciones y </w:t>
+            </w:r>
+            <w:proofErr w:type="spellStart"/>
+            <w:r>
+              <w:rPr>
+                <w:sz w:val="18"/>
+              </w:rPr>
+              <w:t>Ngrok</w:t>
+            </w:r>
+            <w:proofErr w:type="spellEnd"/>
+            <w:r>
+              <w:rPr>
+                <w:sz w:val="18"/>
+              </w:rPr>
+              <w:t xml:space="preserve"> como respaldo.</w:t>
             </w:r>
           </w:p>
         </w:tc>
@@ -9000,7 +10064,15 @@
         <w:jc w:val="both"/>
       </w:pPr>
       <w:r>
-        <w:t>Para la semana 15 el equipo se compromete a: desplegar la plataforma en la nube (H3, semana 11); integrar y probar el sistema de punta a punta y cerrar las brechas del MVP (H4, semana 13); y entregar el proyecto documentado, con manuales de usuario, de administrador y de desarrollo, diagrama de la base de datos, lista de endpoints e informe final (H5, semana 15).</w:t>
+        <w:t xml:space="preserve">Para la semana 15 el equipo se compromete a: desplegar la plataforma en la nube (H3, semana 11); integrar y probar el sistema de punta a punta y cerrar las brechas del MVP (H4, semana 13); y entregar el proyecto documentado, con manuales de usuario, de administrador y de desarrollo, diagrama de la base de datos, lista de </w:t>
+      </w:r>
+      <w:proofErr w:type="spellStart"/>
+      <w:r>
+        <w:t>endpoints</w:t>
+      </w:r>
+      <w:proofErr w:type="spellEnd"/>
+      <w:r>
+        <w:t xml:space="preserve"> e informe final (H5, semana 15).</w:t>
       </w:r>
     </w:p>
     <w:p>
@@ -9009,9 +10081,14 @@
       </w:pPr>
       <w:bookmarkStart w:id="23" w:name="_Toc242915931"/>
       <w:r>
-        <w:t>Individual conclusions</w:t>
+        <w:t xml:space="preserve">Individual </w:t>
+      </w:r>
+      <w:proofErr w:type="spellStart"/>
+      <w:r>
+        <w:t>conclusions</w:t>
       </w:r>
       <w:bookmarkEnd w:id="23"/>
+      <w:proofErr w:type="spellEnd"/>
     </w:p>
     <w:p>
       <w:pPr>
@@ -9026,7 +10103,6 @@
       </w:r>
       <w:r>
         <w:rPr>
-          <w:highlight w:val="yellow"/>
           <w:lang w:val="en-US"/>
         </w:rPr>
         <w:t>Working on the data model and integration, I learned that a project grows on solid foundations. Agreeing early on how the data is organized saved us many problems later.</w:t>
@@ -9041,11 +10117,16 @@
         <w:rPr>
           <w:b/>
         </w:rPr>
-        <w:t xml:space="preserve">Jean Arriagada. </w:t>
-      </w:r>
-      <w:r>
-        <w:rPr>
-          <w:highlight w:val="yellow"/>
+        <w:t>Jean Arriagada</w:t>
+      </w:r>
+      <w:r>
+        <w:rPr>
+          <w:b/>
+        </w:rPr>
+        <w:t xml:space="preserve">. </w:t>
+      </w:r>
+      <w:r>
+        <w:rPr>
           <w:lang w:val="en-US"/>
         </w:rPr>
         <w:t>Building the admin console taught me to see the platform through the eyes of the people who manage it. Clear information and respect for each company's data matter more than extra screens.</w:t>
@@ -9064,7 +10145,6 @@
       </w:r>
       <w:r>
         <w:rPr>
-          <w:highlight w:val="yellow"/>
           <w:lang w:val="en-US"/>
         </w:rPr>
         <w:t>Working on subscriptions and payments showed me that every business rule affects real customers. Thinking about fair warnings and grace periods made me design with the user in mind.</w:t>
@@ -9085,14 +10165,27 @@
         <w:spacing w:after="120"/>
         <w:ind w:left="720" w:hanging="720"/>
       </w:pPr>
-      <w:r>
-        <w:t xml:space="preserve">Alloxentric. (2026a). </w:t>
-      </w:r>
+      <w:proofErr w:type="spellStart"/>
+      <w:r>
+        <w:t>Alloxentric</w:t>
+      </w:r>
+      <w:proofErr w:type="spellEnd"/>
+      <w:r>
+        <w:t xml:space="preserve">. (2026a). </w:t>
+      </w:r>
+      <w:proofErr w:type="spellStart"/>
       <w:r>
         <w:rPr>
           <w:i/>
         </w:rPr>
-        <w:t>Acredittia: modelo de datos</w:t>
+        <w:t>Acredittia</w:t>
+      </w:r>
+      <w:proofErr w:type="spellEnd"/>
+      <w:r>
+        <w:rPr>
+          <w:i/>
+        </w:rPr>
+        <w:t>: modelo de datos</w:t>
       </w:r>
       <w:r>
         <w:t xml:space="preserve"> [Documento técnico interno].</w:t>
@@ -9103,15 +10196,36 @@
         <w:spacing w:after="120"/>
         <w:ind w:left="720" w:hanging="720"/>
       </w:pPr>
-      <w:r>
-        <w:t xml:space="preserve">Alloxentric. (2026b). </w:t>
-      </w:r>
+      <w:proofErr w:type="spellStart"/>
+      <w:r>
+        <w:t>Alloxentric</w:t>
+      </w:r>
+      <w:proofErr w:type="spellEnd"/>
+      <w:r>
+        <w:t xml:space="preserve">. (2026b). </w:t>
+      </w:r>
+      <w:proofErr w:type="spellStart"/>
       <w:r>
         <w:rPr>
           <w:i/>
         </w:rPr>
-        <w:t>Acredittia: especificación de la API del backend</w:t>
-      </w:r>
+        <w:t>Acredittia</w:t>
+      </w:r>
+      <w:proofErr w:type="spellEnd"/>
+      <w:r>
+        <w:rPr>
+          <w:i/>
+        </w:rPr>
+        <w:t xml:space="preserve">: especificación de la API del </w:t>
+      </w:r>
+      <w:proofErr w:type="spellStart"/>
+      <w:r>
+        <w:rPr>
+          <w:i/>
+        </w:rPr>
+        <w:t>backend</w:t>
+      </w:r>
+      <w:proofErr w:type="spellEnd"/>
       <w:r>
         <w:t xml:space="preserve"> [Documento técnico interno].</w:t>
       </w:r>
@@ -9121,14 +10235,27 @@
         <w:spacing w:after="120"/>
         <w:ind w:left="720" w:hanging="720"/>
       </w:pPr>
-      <w:r>
-        <w:t xml:space="preserve">Alloxentric. (2026c). </w:t>
-      </w:r>
+      <w:proofErr w:type="spellStart"/>
+      <w:r>
+        <w:t>Alloxentric</w:t>
+      </w:r>
+      <w:proofErr w:type="spellEnd"/>
+      <w:r>
+        <w:t xml:space="preserve">. (2026c). </w:t>
+      </w:r>
+      <w:proofErr w:type="spellStart"/>
       <w:r>
         <w:rPr>
           <w:i/>
         </w:rPr>
-        <w:t>Acredittia: especificación de la API de la Consola Interna</w:t>
+        <w:t>Acredittia</w:t>
+      </w:r>
+      <w:proofErr w:type="spellEnd"/>
+      <w:r>
+        <w:rPr>
+          <w:i/>
+        </w:rPr>
+        <w:t>: especificación de la API de la Consola Interna</w:t>
       </w:r>
       <w:r>
         <w:t xml:space="preserve"> [Documento técnico interno].</w:t>
@@ -9140,14 +10267,58 @@
         <w:ind w:left="720" w:hanging="720"/>
       </w:pPr>
       <w:r>
-        <w:t xml:space="preserve">PostgreSQL Global Development Group. (2023). </w:t>
+        <w:t xml:space="preserve">PostgreSQL Global </w:t>
+      </w:r>
+      <w:proofErr w:type="spellStart"/>
+      <w:r>
+        <w:t>Development</w:t>
+      </w:r>
+      <w:proofErr w:type="spellEnd"/>
+      <w:r>
+        <w:t xml:space="preserve"> Group. (2023). </w:t>
       </w:r>
       <w:r>
         <w:rPr>
           <w:i/>
         </w:rPr>
-        <w:t>PostgreSQL 16 documentation: Row security policies</w:t>
-      </w:r>
+        <w:t xml:space="preserve">PostgreSQL 16 </w:t>
+      </w:r>
+      <w:proofErr w:type="spellStart"/>
+      <w:r>
+        <w:rPr>
+          <w:i/>
+        </w:rPr>
+        <w:t>documentation</w:t>
+      </w:r>
+      <w:proofErr w:type="spellEnd"/>
+      <w:r>
+        <w:rPr>
+          <w:i/>
+        </w:rPr>
+        <w:t xml:space="preserve">: Row </w:t>
+      </w:r>
+      <w:proofErr w:type="spellStart"/>
+      <w:r>
+        <w:rPr>
+          <w:i/>
+        </w:rPr>
+        <w:t>security</w:t>
+      </w:r>
+      <w:proofErr w:type="spellEnd"/>
+      <w:r>
+        <w:rPr>
+          <w:i/>
+        </w:rPr>
+        <w:t xml:space="preserve"> </w:t>
+      </w:r>
+      <w:proofErr w:type="spellStart"/>
+      <w:r>
+        <w:rPr>
+          <w:i/>
+        </w:rPr>
+        <w:t>policies</w:t>
+      </w:r>
+      <w:proofErr w:type="spellEnd"/>
       <w:r>
         <w:t>. https://www.postgresql.org/docs/16/ddl-rowsecurity.html</w:t>
       </w:r>
@@ -9160,12 +10331,14 @@
       <w:r>
         <w:t xml:space="preserve">Ramírez, S. (s.f.). </w:t>
       </w:r>
+      <w:proofErr w:type="spellStart"/>
       <w:r>
         <w:rPr>
           <w:i/>
         </w:rPr>
         <w:t>FastAPI</w:t>
       </w:r>
+      <w:proofErr w:type="spellEnd"/>
       <w:r>
         <w:t>. https://fastapi.tiangolo.com/</w:t>
       </w:r>
@@ -9193,15 +10366,36 @@
         <w:spacing w:after="120"/>
         <w:ind w:left="720" w:hanging="720"/>
       </w:pPr>
-      <w:r>
-        <w:t xml:space="preserve">SQLAlchemy. (s.f.). </w:t>
-      </w:r>
+      <w:proofErr w:type="spellStart"/>
+      <w:r>
+        <w:t>SQLAlchemy</w:t>
+      </w:r>
+      <w:proofErr w:type="spellEnd"/>
+      <w:r>
+        <w:t xml:space="preserve">. (s.f.). </w:t>
+      </w:r>
+      <w:proofErr w:type="spellStart"/>
       <w:r>
         <w:rPr>
           <w:i/>
         </w:rPr>
-        <w:t>SQLAlchemy 2.0 documentation</w:t>
-      </w:r>
+        <w:t>SQLAlchemy</w:t>
+      </w:r>
+      <w:proofErr w:type="spellEnd"/>
+      <w:r>
+        <w:rPr>
+          <w:i/>
+        </w:rPr>
+        <w:t xml:space="preserve"> 2.0 </w:t>
+      </w:r>
+      <w:proofErr w:type="spellStart"/>
+      <w:r>
+        <w:rPr>
+          <w:i/>
+        </w:rPr>
+        <w:t>documentation</w:t>
+      </w:r>
+      <w:proofErr w:type="spellEnd"/>
       <w:r>
         <w:t>. https://docs.sqlalchemy.org/en/20/</w:t>
       </w:r>
@@ -9212,16 +10406,33 @@
         <w:ind w:left="720" w:hanging="720"/>
       </w:pPr>
       <w:r>
+        <w:lastRenderedPageBreak/>
         <w:t xml:space="preserve">Vera, G. (2026). </w:t>
       </w:r>
       <w:r>
         <w:rPr>
           <w:i/>
         </w:rPr>
-        <w:t>Requerimientos de la consola de administración de Acredittia</w:t>
-      </w:r>
-      <w:r>
-        <w:t xml:space="preserve"> [Documento interno]. Acredittia.</w:t>
+        <w:t xml:space="preserve">Requerimientos de la consola de administración de </w:t>
+      </w:r>
+      <w:proofErr w:type="spellStart"/>
+      <w:r>
+        <w:rPr>
+          <w:i/>
+        </w:rPr>
+        <w:t>Acredittia</w:t>
+      </w:r>
+      <w:proofErr w:type="spellEnd"/>
+      <w:r>
+        <w:t xml:space="preserve"> [Documento interno]. </w:t>
+      </w:r>
+      <w:proofErr w:type="spellStart"/>
+      <w:r>
+        <w:t>Acredittia</w:t>
+      </w:r>
+      <w:proofErr w:type="spellEnd"/>
+      <w:r>
+        <w:t>.</w:t>
       </w:r>
     </w:p>
     <w:p>
@@ -9229,15 +10440,28 @@
         <w:spacing w:after="120"/>
         <w:ind w:left="720" w:hanging="720"/>
       </w:pPr>
-      <w:r>
-        <w:t xml:space="preserve">Vercel. (s.f.). </w:t>
+      <w:proofErr w:type="spellStart"/>
+      <w:r>
+        <w:t>Vercel</w:t>
+      </w:r>
+      <w:proofErr w:type="spellEnd"/>
+      <w:r>
+        <w:t xml:space="preserve">. (s.f.). </w:t>
       </w:r>
       <w:r>
         <w:rPr>
           <w:i/>
         </w:rPr>
-        <w:t>Next.js documentation</w:t>
-      </w:r>
+        <w:t xml:space="preserve">Next.js </w:t>
+      </w:r>
+      <w:proofErr w:type="spellStart"/>
+      <w:r>
+        <w:rPr>
+          <w:i/>
+        </w:rPr>
+        <w:t>documentation</w:t>
+      </w:r>
+      <w:proofErr w:type="spellEnd"/>
       <w:r>
         <w:t>. https://nextjs.org/docs</w:t>
       </w:r>
@@ -9249,6 +10473,7 @@
       </w:pPr>
       <w:bookmarkStart w:id="25" w:name="_Toc242915933"/>
       <w:r>
+        <w:lastRenderedPageBreak/>
         <w:t>Anexo de evidencias</w:t>
       </w:r>
       <w:bookmarkEnd w:id="25"/>
@@ -9318,8 +10543,29 @@
         </w:rPr>
         <w:t xml:space="preserve">Pruebas: </w:t>
       </w:r>
-      <w:r>
-        <w:t>app/backend/tests (339 pruebas aprobadas).</w:t>
+      <w:proofErr w:type="gramStart"/>
+      <w:r>
+        <w:t>app</w:t>
+      </w:r>
+      <w:proofErr w:type="gramEnd"/>
+      <w:r>
+        <w:t>/</w:t>
+      </w:r>
+      <w:proofErr w:type="spellStart"/>
+      <w:r>
+        <w:t>backend</w:t>
+      </w:r>
+      <w:proofErr w:type="spellEnd"/>
+      <w:r>
+        <w:t>/</w:t>
+      </w:r>
+      <w:proofErr w:type="spellStart"/>
+      <w:r>
+        <w:t>tests</w:t>
+      </w:r>
+      <w:proofErr w:type="spellEnd"/>
+      <w:r>
+        <w:t xml:space="preserve"> (339 pruebas aprobadas).</w:t>
       </w:r>
     </w:p>
     <w:p>
@@ -9337,8 +10583,21 @@
         </w:rPr>
         <w:t xml:space="preserve">Modelo de datos: </w:t>
       </w:r>
-      <w:r>
-        <w:t>modelo_datos/ (scripts 01 a 08) y app/backend/scripts/datos_demo.py.</w:t>
+      <w:proofErr w:type="spellStart"/>
+      <w:r>
+        <w:t>modelo_datos</w:t>
+      </w:r>
+      <w:proofErr w:type="spellEnd"/>
+      <w:r>
+        <w:t>/ (scripts 01 a 08) y app/</w:t>
+      </w:r>
+      <w:proofErr w:type="spellStart"/>
+      <w:r>
+        <w:t>backend</w:t>
+      </w:r>
+      <w:proofErr w:type="spellEnd"/>
+      <w:r>
+        <w:t>/scripts/datos_demo.py.</w:t>
       </w:r>
     </w:p>
     <w:p>
@@ -9357,7 +10616,31 @@
         <w:t xml:space="preserve">Documentación de la API: </w:t>
       </w:r>
       <w:r>
-        <w:t>/docs de la API (OpenAPI) y app/backend/RUPTURAS.md.</w:t>
+        <w:t>/</w:t>
+      </w:r>
+      <w:proofErr w:type="spellStart"/>
+      <w:r>
+        <w:t>docs</w:t>
+      </w:r>
+      <w:proofErr w:type="spellEnd"/>
+      <w:r>
+        <w:t xml:space="preserve"> de la API (</w:t>
+      </w:r>
+      <w:proofErr w:type="spellStart"/>
+      <w:r>
+        <w:t>OpenAPI</w:t>
+      </w:r>
+      <w:proofErr w:type="spellEnd"/>
+      <w:r>
+        <w:t>) y app/</w:t>
+      </w:r>
+      <w:proofErr w:type="spellStart"/>
+      <w:r>
+        <w:t>backend</w:t>
+      </w:r>
+      <w:proofErr w:type="spellEnd"/>
+      <w:r>
+        <w:t>/RUPTURAS.md.</w:t>
       </w:r>
     </w:p>
     <w:p>
@@ -9436,6 +10719,7 @@
         <w:rPr>
           <w:noProof/>
         </w:rPr>
+        <w:lastRenderedPageBreak/>
         <w:drawing>
           <wp:inline distT="0" distB="0" distL="0" distR="0" wp14:anchorId="0B3A9436" wp14:editId="6154A2B9">
             <wp:extent cx="5760000" cy="3600000"/>
@@ -9568,6 +10852,7 @@
         <w:rPr>
           <w:noProof/>
         </w:rPr>
+        <w:lastRenderedPageBreak/>
         <w:drawing>
           <wp:inline distT="0" distB="0" distL="0" distR="0" wp14:anchorId="3D80DC32" wp14:editId="138C33F9">
             <wp:extent cx="5760000" cy="3600000"/>
@@ -9700,6 +10985,7 @@
         <w:rPr>
           <w:noProof/>
         </w:rPr>
+        <w:lastRenderedPageBreak/>
         <w:drawing>
           <wp:inline distT="0" distB="0" distL="0" distR="0" wp14:anchorId="24134C3B" wp14:editId="1360318D">
             <wp:extent cx="5760000" cy="3600000"/>
@@ -9753,7 +11039,35 @@
         <w:rPr>
           <w:sz w:val="18"/>
         </w:rPr>
-        <w:t>Documentación OpenAPI generada por la API: endpoints propios del panel de administración y de suscripciones.</w:t>
+        <w:t xml:space="preserve">Documentación </w:t>
+      </w:r>
+      <w:proofErr w:type="spellStart"/>
+      <w:r>
+        <w:rPr>
+          <w:sz w:val="18"/>
+        </w:rPr>
+        <w:t>OpenAPI</w:t>
+      </w:r>
+      <w:proofErr w:type="spellEnd"/>
+      <w:r>
+        <w:rPr>
+          <w:sz w:val="18"/>
+        </w:rPr>
+        <w:t xml:space="preserve"> generada por la API: </w:t>
+      </w:r>
+      <w:proofErr w:type="spellStart"/>
+      <w:r>
+        <w:rPr>
+          <w:sz w:val="18"/>
+        </w:rPr>
+        <w:t>endpoints</w:t>
+      </w:r>
+      <w:proofErr w:type="spellEnd"/>
+      <w:r>
+        <w:rPr>
+          <w:sz w:val="18"/>
+        </w:rPr>
+        <w:t xml:space="preserve"> propios del panel de administración y de suscripciones.</w:t>
       </w:r>
     </w:p>
     <w:p>
@@ -9766,6 +11080,7 @@
         <w:rPr>
           <w:noProof/>
         </w:rPr>
+        <w:lastRenderedPageBreak/>
         <w:drawing>
           <wp:inline distT="0" distB="0" distL="0" distR="0" wp14:anchorId="6C59B7F3" wp14:editId="48F2DB4A">
             <wp:extent cx="5760000" cy="5048440"/>
@@ -9885,7 +11200,21 @@
         <w:rPr>
           <w:sz w:val="18"/>
         </w:rPr>
-        <w:t>Ejecución de la suite de pruebas automatizadas del backend.</w:t>
+        <w:t xml:space="preserve">Ejecución de la suite de pruebas automatizadas del </w:t>
+      </w:r>
+      <w:proofErr w:type="spellStart"/>
+      <w:r>
+        <w:rPr>
+          <w:sz w:val="18"/>
+        </w:rPr>
+        <w:t>backend</w:t>
+      </w:r>
+      <w:proofErr w:type="spellEnd"/>
+      <w:r>
+        <w:rPr>
+          <w:sz w:val="18"/>
+        </w:rPr>
+        <w:t>.</w:t>
       </w:r>
     </w:p>
     <w:sectPr>

</xml_diff>